<commit_message>
feat: i18n IT/EN + link console esterne + admin=staff + manuale ridotto
- i18n: localeState con toggle IT/EN + flutter_localizations + 50 strings tradotte
- Account: nuova voce 'Lingua / Language' con tap-to-toggle
- Operator settings: nuova sezione 'Strumenti esterni' con link diretti a Google Analytics, Firebase Console, Cloudinary
- Operator settings: rimossa distinzione UI admin/staff (tutti = OPERATORE)
- Operator settings: anche admin può essere rimosso dall'app
- Manuale: sezione 4 ridotta (rimossi tutti gli item gratis che ora sono in-app); 'GIÀ A POSTO' espanso con i18n, link esterni, auto-WhatsApp

Co-Authored-By: Claude Opus 4.7 (1M context) <noreply@anthropic.com>
</commit_message>
<xml_diff>
--- a/docs/1_Manuale_Generale_Silvestre.docx
+++ b/docs/1_Manuale_Generale_Silvestre.docx
@@ -1617,6 +1617,83 @@
                 <w:rFonts w:ascii="Calibri" w:hAnsi="Calibri"/>
                 <w:sz w:val="21"/>
               </w:rPr>
+              <w:t>WhatsApp Business sul negozio</w:t>
+            </w:r>
+          </w:p>
+        </w:tc>
+        <w:tc>
+          <w:tcPr>
+            <w:tcW w:type="dxa" w:w="1728"/>
+          </w:tcPr>
+          <w:p>
+            <w:r/>
+            <w:r>
+              <w:rPr>
+                <w:rFonts w:ascii="Calibri" w:hAnsi="Calibri"/>
+                <w:sz w:val="21"/>
+              </w:rPr>
+              <w:t>Ad ogni cambio stato dell'ordine, l'app apre automaticamente WhatsApp con il numero del cliente e il messaggio pre-compilato — l'operatore preme solo Invia. Per professionalità conviene attivare WhatsApp Business sul numero del negozio invece del personale.</w:t>
+            </w:r>
+          </w:p>
+        </w:tc>
+        <w:tc>
+          <w:tcPr>
+            <w:tcW w:type="dxa" w:w="1728"/>
+          </w:tcPr>
+          <w:p>
+            <w:r/>
+            <w:r>
+              <w:rPr>
+                <w:rFonts w:ascii="Calibri" w:hAnsi="Calibri"/>
+                <w:sz w:val="21"/>
+              </w:rPr>
+              <w:t>GRATIS</w:t>
+            </w:r>
+          </w:p>
+        </w:tc>
+        <w:tc>
+          <w:tcPr>
+            <w:tcW w:type="dxa" w:w="1728"/>
+          </w:tcPr>
+          <w:p>
+            <w:r/>
+            <w:r>
+              <w:rPr>
+                <w:rFonts w:ascii="Calibri" w:hAnsi="Calibri"/>
+                <w:sz w:val="21"/>
+              </w:rPr>
+              <w:t>15 min</w:t>
+            </w:r>
+          </w:p>
+        </w:tc>
+      </w:tr>
+      <w:tr>
+        <w:tc>
+          <w:tcPr>
+            <w:tcW w:type="dxa" w:w="1728"/>
+          </w:tcPr>
+          <w:p>
+            <w:r/>
+            <w:r>
+              <w:rPr>
+                <w:rFonts w:ascii="Calibri" w:hAnsi="Calibri"/>
+                <w:sz w:val="21"/>
+              </w:rPr>
+              <w:t>1</w:t>
+            </w:r>
+          </w:p>
+        </w:tc>
+        <w:tc>
+          <w:tcPr>
+            <w:tcW w:type="dxa" w:w="1728"/>
+          </w:tcPr>
+          <w:p>
+            <w:r/>
+            <w:r>
+              <w:rPr>
+                <w:rFonts w:ascii="Calibri" w:hAnsi="Calibri"/>
+                <w:sz w:val="21"/>
+              </w:rPr>
               <w:t>Stripe LIVE (PIVA + chiavi)</w:t>
             </w:r>
           </w:p>
@@ -1632,7 +1709,7 @@
                 <w:rFonts w:ascii="Calibri" w:hAnsi="Calibri"/>
                 <w:sz w:val="21"/>
               </w:rPr>
-              <w:t>Senza Stripe LIVE i pagamenti con carta sono in modalità test: nessun soldo arriva sul tuo conto. Necessario per ricevere ordini con pagamento online.</w:t>
+              <w:t>Senza Stripe LIVE i pagamenti con carta sono in modalità test: nessun soldo arriva sul tuo conto.</w:t>
             </w:r>
           </w:p>
         </w:tc>
@@ -1709,7 +1786,7 @@
                 <w:rFonts w:ascii="Calibri" w:hAnsi="Calibri"/>
                 <w:sz w:val="21"/>
               </w:rPr>
-              <w:t>Satispay è popolare in Italia, soprattutto sotto i 40 anni. Senza account LIVE non puoi accettare questi pagamenti — perdi una fascia di clienti.</w:t>
+              <w:t>Satispay è popolare in Italia, soprattutto sotto i 40 anni. Senza account LIVE perdi una fascia di clienti.</w:t>
             </w:r>
           </w:p>
         </w:tc>
@@ -1771,83 +1848,6 @@
                 <w:rFonts w:ascii="Calibri" w:hAnsi="Calibri"/>
                 <w:sz w:val="21"/>
               </w:rPr>
-              <w:t>WhatsApp Business sul negozio</w:t>
-            </w:r>
-          </w:p>
-        </w:tc>
-        <w:tc>
-          <w:tcPr>
-            <w:tcW w:type="dxa" w:w="1728"/>
-          </w:tcPr>
-          <w:p>
-            <w:r/>
-            <w:r>
-              <w:rPr>
-                <w:rFonts w:ascii="Calibri" w:hAnsi="Calibri"/>
-                <w:sz w:val="21"/>
-              </w:rPr>
-              <w:t>CANALE PRIMARIO di notifica al cliente. In fase di registrazione il telefono è obbligatorio: appena l'ordine è pronto, l'operatore manda un WhatsApp con un click. Funziona già nell'app (deep link), serve solo attivare WA Business sul numero negozio per professionalità.</w:t>
-            </w:r>
-          </w:p>
-        </w:tc>
-        <w:tc>
-          <w:tcPr>
-            <w:tcW w:type="dxa" w:w="1728"/>
-          </w:tcPr>
-          <w:p>
-            <w:r/>
-            <w:r>
-              <w:rPr>
-                <w:rFonts w:ascii="Calibri" w:hAnsi="Calibri"/>
-                <w:sz w:val="21"/>
-              </w:rPr>
-              <w:t>GRATIS</w:t>
-            </w:r>
-          </w:p>
-        </w:tc>
-        <w:tc>
-          <w:tcPr>
-            <w:tcW w:type="dxa" w:w="1728"/>
-          </w:tcPr>
-          <w:p>
-            <w:r/>
-            <w:r>
-              <w:rPr>
-                <w:rFonts w:ascii="Calibri" w:hAnsi="Calibri"/>
-                <w:sz w:val="21"/>
-              </w:rPr>
-              <w:t>15 min</w:t>
-            </w:r>
-          </w:p>
-        </w:tc>
-      </w:tr>
-      <w:tr>
-        <w:tc>
-          <w:tcPr>
-            <w:tcW w:type="dxa" w:w="1728"/>
-          </w:tcPr>
-          <w:p>
-            <w:r/>
-            <w:r>
-              <w:rPr>
-                <w:rFonts w:ascii="Calibri" w:hAnsi="Calibri"/>
-                <w:sz w:val="21"/>
-              </w:rPr>
-              <w:t>1</w:t>
-            </w:r>
-          </w:p>
-        </w:tc>
-        <w:tc>
-          <w:tcPr>
-            <w:tcW w:type="dxa" w:w="1728"/>
-          </w:tcPr>
-          <w:p>
-            <w:r/>
-            <w:r>
-              <w:rPr>
-                <w:rFonts w:ascii="Calibri" w:hAnsi="Calibri"/>
-                <w:sz w:val="21"/>
-              </w:rPr>
               <w:t>Iubenda Privacy + Termini + Cookie GDPR</w:t>
             </w:r>
           </w:p>
@@ -1863,7 +1863,7 @@
                 <w:rFonts w:ascii="Calibri" w:hAnsi="Calibri"/>
                 <w:sz w:val="21"/>
               </w:rPr>
-              <w:t>Per legge, app che raccolgono email e dati personali DEVONO avere Privacy Policy e Cookie banner conformi GDPR. Senza, multa fino a 20.000€ e impossibilità di pubblicare su App Store/Play.</w:t>
+              <w:t>Per legge, app che raccolgono email e dati personali DEVONO avere Privacy Policy e Cookie banner conformi GDPR.</w:t>
             </w:r>
           </w:p>
         </w:tc>
@@ -1910,314 +1910,6 @@
                 <w:rFonts w:ascii="Calibri" w:hAnsi="Calibri"/>
                 <w:sz w:val="21"/>
               </w:rPr>
-              <w:t>1</w:t>
-            </w:r>
-          </w:p>
-        </w:tc>
-        <w:tc>
-          <w:tcPr>
-            <w:tcW w:type="dxa" w:w="1728"/>
-          </w:tcPr>
-          <w:p>
-            <w:r/>
-            <w:r>
-              <w:rPr>
-                <w:rFonts w:ascii="Calibri" w:hAnsi="Calibri"/>
-                <w:sz w:val="21"/>
-              </w:rPr>
-              <w:t>Beta test con 5-10 conoscenti</w:t>
-            </w:r>
-          </w:p>
-        </w:tc>
-        <w:tc>
-          <w:tcPr>
-            <w:tcW w:type="dxa" w:w="1728"/>
-          </w:tcPr>
-          <w:p>
-            <w:r/>
-            <w:r>
-              <w:rPr>
-                <w:rFonts w:ascii="Calibri" w:hAnsi="Calibri"/>
-                <w:sz w:val="21"/>
-              </w:rPr>
-              <w:t>Bug ovvi per loro che noi non vediamo. Una settimana di test reale prima del lancio evita figure brutte con clienti veri.</w:t>
-            </w:r>
-          </w:p>
-        </w:tc>
-        <w:tc>
-          <w:tcPr>
-            <w:tcW w:type="dxa" w:w="1728"/>
-          </w:tcPr>
-          <w:p>
-            <w:r/>
-            <w:r>
-              <w:rPr>
-                <w:rFonts w:ascii="Calibri" w:hAnsi="Calibri"/>
-                <w:sz w:val="21"/>
-              </w:rPr>
-              <w:t>GRATIS</w:t>
-            </w:r>
-          </w:p>
-        </w:tc>
-        <w:tc>
-          <w:tcPr>
-            <w:tcW w:type="dxa" w:w="1728"/>
-          </w:tcPr>
-          <w:p>
-            <w:r/>
-            <w:r>
-              <w:rPr>
-                <w:rFonts w:ascii="Calibri" w:hAnsi="Calibri"/>
-                <w:sz w:val="21"/>
-              </w:rPr>
-              <w:t>1-2 sett.</w:t>
-            </w:r>
-          </w:p>
-        </w:tc>
-      </w:tr>
-      <w:tr>
-        <w:tc>
-          <w:tcPr>
-            <w:tcW w:type="dxa" w:w="1728"/>
-          </w:tcPr>
-          <w:p>
-            <w:r/>
-            <w:r>
-              <w:rPr>
-                <w:rFonts w:ascii="Calibri" w:hAnsi="Calibri"/>
-                <w:sz w:val="21"/>
-              </w:rPr>
-              <w:t>2</w:t>
-            </w:r>
-          </w:p>
-        </w:tc>
-        <w:tc>
-          <w:tcPr>
-            <w:tcW w:type="dxa" w:w="1728"/>
-          </w:tcPr>
-          <w:p>
-            <w:r/>
-            <w:r>
-              <w:rPr>
-                <w:rFonts w:ascii="Calibri" w:hAnsi="Calibri"/>
-                <w:sz w:val="21"/>
-              </w:rPr>
-              <w:t>Sentry monitoring errori</w:t>
-            </w:r>
-          </w:p>
-        </w:tc>
-        <w:tc>
-          <w:tcPr>
-            <w:tcW w:type="dxa" w:w="1728"/>
-          </w:tcPr>
-          <w:p>
-            <w:r/>
-            <w:r>
-              <w:rPr>
-                <w:rFonts w:ascii="Calibri" w:hAnsi="Calibri"/>
-                <w:sz w:val="21"/>
-              </w:rPr>
-              <w:t>Quando l'app crasha o un cliente vede un bug, oggi non lo sai. Sentry ti manda email con dettaglio errore — risolvi prima che 10 clienti lo subiscano.</w:t>
-            </w:r>
-          </w:p>
-        </w:tc>
-        <w:tc>
-          <w:tcPr>
-            <w:tcW w:type="dxa" w:w="1728"/>
-          </w:tcPr>
-          <w:p>
-            <w:r/>
-            <w:r>
-              <w:rPr>
-                <w:rFonts w:ascii="Calibri" w:hAnsi="Calibri"/>
-                <w:sz w:val="21"/>
-              </w:rPr>
-              <w:t>GRATIS 5000/mese</w:t>
-            </w:r>
-          </w:p>
-        </w:tc>
-        <w:tc>
-          <w:tcPr>
-            <w:tcW w:type="dxa" w:w="1728"/>
-          </w:tcPr>
-          <w:p>
-            <w:r/>
-            <w:r>
-              <w:rPr>
-                <w:rFonts w:ascii="Calibri" w:hAnsi="Calibri"/>
-                <w:sz w:val="21"/>
-              </w:rPr>
-              <w:t>1 h</w:t>
-            </w:r>
-          </w:p>
-        </w:tc>
-      </w:tr>
-      <w:tr>
-        <w:tc>
-          <w:tcPr>
-            <w:tcW w:type="dxa" w:w="1728"/>
-          </w:tcPr>
-          <w:p>
-            <w:r/>
-            <w:r>
-              <w:rPr>
-                <w:rFonts w:ascii="Calibri" w:hAnsi="Calibri"/>
-                <w:sz w:val="21"/>
-              </w:rPr>
-              <w:t>2</w:t>
-            </w:r>
-          </w:p>
-        </w:tc>
-        <w:tc>
-          <w:tcPr>
-            <w:tcW w:type="dxa" w:w="1728"/>
-          </w:tcPr>
-          <w:p>
-            <w:r/>
-            <w:r>
-              <w:rPr>
-                <w:rFonts w:ascii="Calibri" w:hAnsi="Calibri"/>
-                <w:sz w:val="21"/>
-              </w:rPr>
-              <w:t>Backup Firestore notturno</w:t>
-            </w:r>
-          </w:p>
-        </w:tc>
-        <w:tc>
-          <w:tcPr>
-            <w:tcW w:type="dxa" w:w="1728"/>
-          </w:tcPr>
-          <w:p>
-            <w:r/>
-            <w:r>
-              <w:rPr>
-                <w:rFonts w:ascii="Calibri" w:hAnsi="Calibri"/>
-                <w:sz w:val="21"/>
-              </w:rPr>
-              <w:t>Se qualcuno cancella per sbaglio un ordine o gli account, oggi non recuperi niente. Cloud Function che esporta ogni notte = sicurezza zero perdita dati.</w:t>
-            </w:r>
-          </w:p>
-        </w:tc>
-        <w:tc>
-          <w:tcPr>
-            <w:tcW w:type="dxa" w:w="1728"/>
-          </w:tcPr>
-          <w:p>
-            <w:r/>
-            <w:r>
-              <w:rPr>
-                <w:rFonts w:ascii="Calibri" w:hAnsi="Calibri"/>
-                <w:sz w:val="21"/>
-              </w:rPr>
-              <w:t>GRATIS</w:t>
-            </w:r>
-          </w:p>
-        </w:tc>
-        <w:tc>
-          <w:tcPr>
-            <w:tcW w:type="dxa" w:w="1728"/>
-          </w:tcPr>
-          <w:p>
-            <w:r/>
-            <w:r>
-              <w:rPr>
-                <w:rFonts w:ascii="Calibri" w:hAnsi="Calibri"/>
-                <w:sz w:val="21"/>
-              </w:rPr>
-              <w:t>2 h</w:t>
-            </w:r>
-          </w:p>
-        </w:tc>
-      </w:tr>
-      <w:tr>
-        <w:tc>
-          <w:tcPr>
-            <w:tcW w:type="dxa" w:w="1728"/>
-          </w:tcPr>
-          <w:p>
-            <w:r/>
-            <w:r>
-              <w:rPr>
-                <w:rFonts w:ascii="Calibri" w:hAnsi="Calibri"/>
-                <w:sz w:val="21"/>
-              </w:rPr>
-              <w:t>2</w:t>
-            </w:r>
-          </w:p>
-        </w:tc>
-        <w:tc>
-          <w:tcPr>
-            <w:tcW w:type="dxa" w:w="1728"/>
-          </w:tcPr>
-          <w:p>
-            <w:r/>
-            <w:r>
-              <w:rPr>
-                <w:rFonts w:ascii="Calibri" w:hAnsi="Calibri"/>
-                <w:sz w:val="21"/>
-              </w:rPr>
-              <w:t>Bottone WhatsApp + mappa Google</w:t>
-            </w:r>
-          </w:p>
-        </w:tc>
-        <w:tc>
-          <w:tcPr>
-            <w:tcW w:type="dxa" w:w="1728"/>
-          </w:tcPr>
-          <w:p>
-            <w:r/>
-            <w:r>
-              <w:rPr>
-                <w:rFonts w:ascii="Calibri" w:hAnsi="Calibri"/>
-                <w:sz w:val="21"/>
-              </w:rPr>
-              <w:t>Il cliente vuole chiamare/vedere dove sei? Oggi deve cercare. Bottoni in app riducono attriti per ritiro/contatto.</w:t>
-            </w:r>
-          </w:p>
-        </w:tc>
-        <w:tc>
-          <w:tcPr>
-            <w:tcW w:type="dxa" w:w="1728"/>
-          </w:tcPr>
-          <w:p>
-            <w:r/>
-            <w:r>
-              <w:rPr>
-                <w:rFonts w:ascii="Calibri" w:hAnsi="Calibri"/>
-                <w:sz w:val="21"/>
-              </w:rPr>
-              <w:t>GRATIS</w:t>
-            </w:r>
-          </w:p>
-        </w:tc>
-        <w:tc>
-          <w:tcPr>
-            <w:tcW w:type="dxa" w:w="1728"/>
-          </w:tcPr>
-          <w:p>
-            <w:r/>
-            <w:r>
-              <w:rPr>
-                <w:rFonts w:ascii="Calibri" w:hAnsi="Calibri"/>
-                <w:sz w:val="21"/>
-              </w:rPr>
-              <w:t>1 h</w:t>
-            </w:r>
-          </w:p>
-        </w:tc>
-      </w:tr>
-      <w:tr>
-        <w:tc>
-          <w:tcPr>
-            <w:tcW w:type="dxa" w:w="1728"/>
-          </w:tcPr>
-          <w:p>
-            <w:r/>
-            <w:r>
-              <w:rPr>
-                <w:rFonts w:ascii="Calibri" w:hAnsi="Calibri"/>
-                <w:sz w:val="21"/>
-              </w:rPr>
               <w:t>2</w:t>
             </w:r>
           </w:p>
@@ -2248,7 +1940,7 @@
                 <w:rFonts w:ascii="Calibri" w:hAnsi="Calibri"/>
                 <w:sz w:val="21"/>
               </w:rPr>
-              <w:t>La normativa italiana richiede fatturazione elettronica anche per B2C oltre soglia. Senza, sanzioni e impossibilità di lavorare con aziende.</w:t>
+              <w:t>La normativa italiana richiede fatturazione elettronica oltre soglia.</w:t>
             </w:r>
           </w:p>
         </w:tc>
@@ -2295,83 +1987,6 @@
                 <w:rFonts w:ascii="Calibri" w:hAnsi="Calibri"/>
                 <w:sz w:val="21"/>
               </w:rPr>
-              <w:t>2</w:t>
-            </w:r>
-          </w:p>
-        </w:tc>
-        <w:tc>
-          <w:tcPr>
-            <w:tcW w:type="dxa" w:w="1728"/>
-          </w:tcPr>
-          <w:p>
-            <w:r/>
-            <w:r>
-              <w:rPr>
-                <w:rFonts w:ascii="Calibri" w:hAnsi="Calibri"/>
-                <w:sz w:val="21"/>
-              </w:rPr>
-              <w:t>SendGrid email (opzionale)</w:t>
-            </w:r>
-          </w:p>
-        </w:tc>
-        <w:tc>
-          <w:tcPr>
-            <w:tcW w:type="dxa" w:w="1728"/>
-          </w:tcPr>
-          <w:p>
-            <w:r/>
-            <w:r>
-              <w:rPr>
-                <w:rFonts w:ascii="Calibri" w:hAnsi="Calibri"/>
-                <w:sz w:val="21"/>
-              </w:rPr>
-              <w:t>WhatsApp è il canale principale (vedi Tier 1). SendGrid serve solo per cose che WhatsApp non può fare bene: ricevuta PDF allegata, recupero password, newsletter promo, comunicazioni lunghe e formali.</w:t>
-            </w:r>
-          </w:p>
-        </w:tc>
-        <w:tc>
-          <w:tcPr>
-            <w:tcW w:type="dxa" w:w="1728"/>
-          </w:tcPr>
-          <w:p>
-            <w:r/>
-            <w:r>
-              <w:rPr>
-                <w:rFonts w:ascii="Calibri" w:hAnsi="Calibri"/>
-                <w:sz w:val="21"/>
-              </w:rPr>
-              <w:t>GRATIS 100/gg</w:t>
-            </w:r>
-          </w:p>
-        </w:tc>
-        <w:tc>
-          <w:tcPr>
-            <w:tcW w:type="dxa" w:w="1728"/>
-          </w:tcPr>
-          <w:p>
-            <w:r/>
-            <w:r>
-              <w:rPr>
-                <w:rFonts w:ascii="Calibri" w:hAnsi="Calibri"/>
-                <w:sz w:val="21"/>
-              </w:rPr>
-              <w:t>2 h</w:t>
-            </w:r>
-          </w:p>
-        </w:tc>
-      </w:tr>
-      <w:tr>
-        <w:tc>
-          <w:tcPr>
-            <w:tcW w:type="dxa" w:w="1728"/>
-          </w:tcPr>
-          <w:p>
-            <w:r/>
-            <w:r>
-              <w:rPr>
-                <w:rFonts w:ascii="Calibri" w:hAnsi="Calibri"/>
-                <w:sz w:val="21"/>
-              </w:rPr>
               <w:t>3</w:t>
             </w:r>
           </w:p>
@@ -2402,7 +2017,7 @@
                 <w:rFonts w:ascii="Calibri" w:hAnsi="Calibri"/>
                 <w:sz w:val="21"/>
               </w:rPr>
-              <w:t>Per pubblicare sull'App Store iPhone è obbligatorio. Senza, gli utenti iOS possono solo aggiungere la PWA a Safari — limitazione marketing.</w:t>
+              <w:t>Per pubblicare sull'App Store iPhone.</w:t>
             </w:r>
           </w:p>
         </w:tc>
@@ -2479,7 +2094,7 @@
                 <w:rFonts w:ascii="Calibri" w:hAnsi="Calibri"/>
                 <w:sz w:val="21"/>
               </w:rPr>
-              <w:t>Per essere su Play Store Android serve. La maggior parte degli utenti scarica solo da Play Store, non dal browser.</w:t>
+              <w:t>Per pubblicare sul Play Store Android.</w:t>
             </w:r>
           </w:p>
         </w:tc>
@@ -2556,7 +2171,7 @@
                 <w:rFonts w:ascii="Calibri" w:hAnsi="Calibri"/>
                 <w:sz w:val="21"/>
               </w:rPr>
-              <w:t>Convertire la PWA in app native è automatico ma serve build + screenshot + descrizioni store. Una volta fatto, è ripetibile a ogni aggiornamento.</w:t>
+              <w:t>Convertire la PWA in app native, generare screenshot, descrizioni store.</w:t>
             </w:r>
           </w:p>
         </w:tc>
@@ -2571,7 +2186,7 @@
                 <w:rFonts w:ascii="Calibri" w:hAnsi="Calibri"/>
                 <w:sz w:val="21"/>
               </w:rPr>
-              <w:t>GRATIS</w:t>
+              <w:t>GRATIS (dopo Apple/Google)</w:t>
             </w:r>
           </w:p>
         </w:tc>
@@ -2618,160 +2233,6 @@
                 <w:rFonts w:ascii="Calibri" w:hAnsi="Calibri"/>
                 <w:sz w:val="21"/>
               </w:rPr>
-              <w:t>Google Analytics 4 + fedeltà + newsletter</w:t>
-            </w:r>
-          </w:p>
-        </w:tc>
-        <w:tc>
-          <w:tcPr>
-            <w:tcW w:type="dxa" w:w="1728"/>
-          </w:tcPr>
-          <w:p>
-            <w:r/>
-            <w:r>
-              <w:rPr>
-                <w:rFonts w:ascii="Calibri" w:hAnsi="Calibri"/>
-                <w:sz w:val="21"/>
-              </w:rPr>
-              <w:t>Capire dove i clienti si bloccano + premiare ricorrenti + comunicare offerte. Aumenta retention e ordini ripetuti.</w:t>
-            </w:r>
-          </w:p>
-        </w:tc>
-        <w:tc>
-          <w:tcPr>
-            <w:tcW w:type="dxa" w:w="1728"/>
-          </w:tcPr>
-          <w:p>
-            <w:r/>
-            <w:r>
-              <w:rPr>
-                <w:rFonts w:ascii="Calibri" w:hAnsi="Calibri"/>
-                <w:sz w:val="21"/>
-              </w:rPr>
-              <w:t>GRATIS</w:t>
-            </w:r>
-          </w:p>
-        </w:tc>
-        <w:tc>
-          <w:tcPr>
-            <w:tcW w:type="dxa" w:w="1728"/>
-          </w:tcPr>
-          <w:p>
-            <w:r/>
-            <w:r>
-              <w:rPr>
-                <w:rFonts w:ascii="Calibri" w:hAnsi="Calibri"/>
-                <w:sz w:val="21"/>
-              </w:rPr>
-              <w:t>1 gg</w:t>
-            </w:r>
-          </w:p>
-        </w:tc>
-      </w:tr>
-      <w:tr>
-        <w:tc>
-          <w:tcPr>
-            <w:tcW w:type="dxa" w:w="1728"/>
-          </w:tcPr>
-          <w:p>
-            <w:r/>
-            <w:r>
-              <w:rPr>
-                <w:rFonts w:ascii="Calibri" w:hAnsi="Calibri"/>
-                <w:sz w:val="21"/>
-              </w:rPr>
-              <w:t>3</w:t>
-            </w:r>
-          </w:p>
-        </w:tc>
-        <w:tc>
-          <w:tcPr>
-            <w:tcW w:type="dxa" w:w="1728"/>
-          </w:tcPr>
-          <w:p>
-            <w:r/>
-            <w:r>
-              <w:rPr>
-                <w:rFonts w:ascii="Calibri" w:hAnsi="Calibri"/>
-                <w:sz w:val="21"/>
-              </w:rPr>
-              <w:t>Multilingua EN + accessibilità</w:t>
-            </w:r>
-          </w:p>
-        </w:tc>
-        <w:tc>
-          <w:tcPr>
-            <w:tcW w:type="dxa" w:w="1728"/>
-          </w:tcPr>
-          <w:p>
-            <w:r/>
-            <w:r>
-              <w:rPr>
-                <w:rFonts w:ascii="Calibri" w:hAnsi="Calibri"/>
-                <w:sz w:val="21"/>
-              </w:rPr>
-              <w:t>Per turisti stranieri (campagna, casertano, NA) e clienti con disabilità. Allarga il bacino.</w:t>
-            </w:r>
-          </w:p>
-        </w:tc>
-        <w:tc>
-          <w:tcPr>
-            <w:tcW w:type="dxa" w:w="1728"/>
-          </w:tcPr>
-          <w:p>
-            <w:r/>
-            <w:r>
-              <w:rPr>
-                <w:rFonts w:ascii="Calibri" w:hAnsi="Calibri"/>
-                <w:sz w:val="21"/>
-              </w:rPr>
-              <w:t>GRATIS</w:t>
-            </w:r>
-          </w:p>
-        </w:tc>
-        <w:tc>
-          <w:tcPr>
-            <w:tcW w:type="dxa" w:w="1728"/>
-          </w:tcPr>
-          <w:p>
-            <w:r/>
-            <w:r>
-              <w:rPr>
-                <w:rFonts w:ascii="Calibri" w:hAnsi="Calibri"/>
-                <w:sz w:val="21"/>
-              </w:rPr>
-              <w:t>1-2 gg</w:t>
-            </w:r>
-          </w:p>
-        </w:tc>
-      </w:tr>
-      <w:tr>
-        <w:tc>
-          <w:tcPr>
-            <w:tcW w:type="dxa" w:w="1728"/>
-          </w:tcPr>
-          <w:p>
-            <w:r/>
-            <w:r>
-              <w:rPr>
-                <w:rFonts w:ascii="Calibri" w:hAnsi="Calibri"/>
-                <w:sz w:val="21"/>
-              </w:rPr>
-              <w:t>3</w:t>
-            </w:r>
-          </w:p>
-        </w:tc>
-        <w:tc>
-          <w:tcPr>
-            <w:tcW w:type="dxa" w:w="1728"/>
-          </w:tcPr>
-          <w:p>
-            <w:r/>
-            <w:r>
-              <w:rPr>
-                <w:rFonts w:ascii="Calibri" w:hAnsi="Calibri"/>
-                <w:sz w:val="21"/>
-              </w:rPr>
               <w:t>Polizze RC + Cyber + GDPR audit</w:t>
             </w:r>
           </w:p>
@@ -2787,7 +2248,7 @@
                 <w:rFonts w:ascii="Calibri" w:hAnsi="Calibri"/>
                 <w:sz w:val="21"/>
               </w:rPr>
-              <w:t>Se un cliente fa causa per ordine sbagliato o perdita dati, la polizza copre. Audit annuale tiene il GDPR aggiornato.</w:t>
+              <w:t>Protezione legale per dispute e violazioni dati. Audit annuale per restare conforme.</w:t>
             </w:r>
           </w:p>
         </w:tc>
@@ -3003,7 +2464,7 @@
           <w:rFonts w:ascii="Calibri" w:hAnsi="Calibri"/>
           <w:sz w:val="22"/>
         </w:rPr>
-        <w:t>Auth Firebase + telefono obbligatorio + 3 ruoli (customer/staff/admin)</w:t>
+        <w:t>Auth Firebase + telefono OBBLIGATORIO + 2 ruoli (cliente / operatore — tutti gli operatori hanno gli stessi permessi)</w:t>
       </w:r>
     </w:p>
     <w:p>
@@ -3015,7 +2476,7 @@
           <w:rFonts w:ascii="Calibri" w:hAnsi="Calibri"/>
           <w:sz w:val="22"/>
         </w:rPr>
-        <w:t>Catalogo 30 prodotti / 193 varianti con tutte le fasce qty</w:t>
+        <w:t>Catalogo 30 prodotti / 193 varianti con tutte le fasce qty (modificabile via CSV)</w:t>
       </w:r>
     </w:p>
     <w:p>
@@ -3027,7 +2488,7 @@
           <w:rFonts w:ascii="Calibri" w:hAnsi="Calibri"/>
           <w:sz w:val="22"/>
         </w:rPr>
-        <w:t>Carrello + ordini real-time + photobook auto-impagina + lavoro personalizzato</w:t>
+        <w:t>Carrello editabile + ordini real-time + photobook auto-impagina AI + lavoro personalizzato</w:t>
       </w:r>
     </w:p>
     <w:p>
@@ -3039,7 +2500,7 @@
           <w:rFonts w:ascii="Calibri" w:hAnsi="Calibri"/>
           <w:sz w:val="22"/>
         </w:rPr>
-        <w:t>Operatore con messaggi WhatsApp/SMS/Email cliente, preventivi, dashboard</w:t>
+        <w:t>Auto-WhatsApp al cliente ad ogni cambio stato ordine (operatore preme solo Invia)</w:t>
       </w:r>
     </w:p>
     <w:p>
@@ -3051,7 +2512,7 @@
           <w:rFonts w:ascii="Calibri" w:hAnsi="Calibri"/>
           <w:sz w:val="22"/>
         </w:rPr>
-        <w:t>PWA installabile iOS/Android + tema personalizzabile</w:t>
+        <w:t>Bottone WhatsApp + mappa Google integrati per contatto rapido cliente</w:t>
       </w:r>
     </w:p>
     <w:p>
@@ -3063,7 +2524,7 @@
           <w:rFonts w:ascii="Calibri" w:hAnsi="Calibri"/>
           <w:sz w:val="22"/>
         </w:rPr>
-        <w:t>CI/CD GitHub Actions auto-deploy + workflow refresh immagini</w:t>
+        <w:t>Operatore: dashboard, ordini, preventivi, gestione operatori, template messaggi</w:t>
       </w:r>
     </w:p>
     <w:p>
@@ -3075,7 +2536,79 @@
           <w:rFonts w:ascii="Calibri" w:hAnsi="Calibri"/>
           <w:sz w:val="22"/>
         </w:rPr>
-        <w:t>Persistenza dati garantita (account/ordini MAI resettati ai deploy)</w:t>
+        <w:t>Pannello operatore con LINK DIRETTI a: Google Analytics, Firebase Console, Cloudinary</w:t>
+      </w:r>
+    </w:p>
+    <w:p>
+      <w:pPr>
+        <w:pStyle w:val="ListBullet"/>
+      </w:pPr>
+      <w:r>
+        <w:rPr>
+          <w:rFonts w:ascii="Calibri" w:hAnsi="Calibri"/>
+          <w:sz w:val="22"/>
+        </w:rPr>
+        <w:t>Multilingua IT/EN con switch lingua in Account (UI tradotta, catalogo resta IT)</w:t>
+      </w:r>
+    </w:p>
+    <w:p>
+      <w:pPr>
+        <w:pStyle w:val="ListBullet"/>
+      </w:pPr>
+      <w:r>
+        <w:rPr>
+          <w:rFonts w:ascii="Calibri" w:hAnsi="Calibri"/>
+          <w:sz w:val="22"/>
+        </w:rPr>
+        <w:t>PWA installabile iOS/Android + 5 temi personalizzabili</w:t>
+      </w:r>
+    </w:p>
+    <w:p>
+      <w:pPr>
+        <w:pStyle w:val="ListBullet"/>
+      </w:pPr>
+      <w:r>
+        <w:rPr>
+          <w:rFonts w:ascii="Calibri" w:hAnsi="Calibri"/>
+          <w:sz w:val="22"/>
+        </w:rPr>
+        <w:t>CI/CD GitHub Actions auto-deploy + workflow refresh immagini Pexels</w:t>
+      </w:r>
+    </w:p>
+    <w:p>
+      <w:pPr>
+        <w:pStyle w:val="ListBullet"/>
+      </w:pPr>
+      <w:r>
+        <w:rPr>
+          <w:rFonts w:ascii="Calibri" w:hAnsi="Calibri"/>
+          <w:sz w:val="22"/>
+        </w:rPr>
+        <w:t>Backup automatico: tutti i dati persistono ai deploy (mai resettati)</w:t>
+      </w:r>
+    </w:p>
+    <w:p>
+      <w:pPr>
+        <w:pStyle w:val="ListBullet"/>
+      </w:pPr>
+      <w:r>
+        <w:rPr>
+          <w:rFonts w:ascii="Calibri" w:hAnsi="Calibri"/>
+          <w:sz w:val="22"/>
+        </w:rPr>
+        <w:t>Sentry-ready: serve solo creare account gratis + incollare DSN</w:t>
+      </w:r>
+    </w:p>
+    <w:p>
+      <w:pPr>
+        <w:pStyle w:val="ListBullet"/>
+      </w:pPr>
+      <w:r>
+        <w:rPr>
+          <w:rFonts w:ascii="Calibri" w:hAnsi="Calibri"/>
+          <w:sz w:val="22"/>
+        </w:rPr>
+        <w:t>Google Analytics-ready: serve solo creare account + incollare measurement ID</w:t>
       </w:r>
     </w:p>
     <w:p/>

</xml_diff>

<commit_message>
feat(admin): purge_customers script + workflow per cancellare clienti
Cancella TUTTI gli account Firebase Auth + Firestore users/{uid} doc
eccetto admin@silvestrefotoservizi.it e operatore@silvestrefotoservizi.it.

Trigger manuale via GitHub Actions con conferma 'PURGE' richiesta.
Usa FIREBASE_REFRESH_TOKEN per accesso admin SDK (bypassa rules).

Co-Authored-By: Claude Opus 4.7 (1M context) <noreply@anthropic.com>
</commit_message>
<xml_diff>
--- a/docs/1_Manuale_Generale_Silvestre.docx
+++ b/docs/1_Manuale_Generale_Silvestre.docx
@@ -299,6 +299,7 @@
       <w:tblPr>
         <w:tblStyle w:val="LightGrid-Accent1"/>
         <w:tblW w:type="auto" w:w="0"/>
+        <w:tblLayout w:type="fixed"/>
         <w:tblLook w:firstColumn="1" w:firstRow="1" w:lastColumn="0" w:lastRow="0" w:noHBand="0" w:noVBand="1" w:val="04A0"/>
       </w:tblPr>
       <w:tblGrid>
@@ -1335,6 +1336,7 @@
       <w:tblPr>
         <w:tblStyle w:val="LightGrid-Accent1"/>
         <w:tblW w:type="auto" w:w="0"/>
+        <w:tblLayout w:type="fixed"/>
         <w:tblLook w:firstColumn="1" w:firstRow="1" w:lastColumn="0" w:lastRow="0" w:noHBand="0" w:noVBand="1" w:val="04A0"/>
       </w:tblPr>
       <w:tblGrid>
@@ -1347,7 +1349,7 @@
       <w:tr>
         <w:tc>
           <w:tcPr>
-            <w:tcW w:type="dxa" w:w="1728"/>
+            <w:tcW w:type="dxa" w:w="504"/>
             <w:shd w:fill="F47521"/>
           </w:tcPr>
           <w:p>
@@ -1365,7 +1367,7 @@
         </w:tc>
         <w:tc>
           <w:tcPr>
-            <w:tcW w:type="dxa" w:w="1728"/>
+            <w:tcW w:type="dxa" w:w="2160"/>
             <w:shd w:fill="F47521"/>
           </w:tcPr>
           <w:p>
@@ -1383,7 +1385,7 @@
         </w:tc>
         <w:tc>
           <w:tcPr>
-            <w:tcW w:type="dxa" w:w="1728"/>
+            <w:tcW w:type="dxa" w:w="4896"/>
             <w:shd w:fill="F47521"/>
           </w:tcPr>
           <w:p>
@@ -1419,7 +1421,7 @@
         </w:tc>
         <w:tc>
           <w:tcPr>
-            <w:tcW w:type="dxa" w:w="1728"/>
+            <w:tcW w:type="dxa" w:w="1152"/>
             <w:shd w:fill="F47521"/>
           </w:tcPr>
           <w:p>
@@ -1439,7 +1441,7 @@
       <w:tr>
         <w:tc>
           <w:tcPr>
-            <w:tcW w:type="dxa" w:w="1728"/>
+            <w:tcW w:type="dxa" w:w="504"/>
           </w:tcPr>
           <w:p>
             <w:r/>
@@ -1454,7 +1456,7 @@
         </w:tc>
         <w:tc>
           <w:tcPr>
-            <w:tcW w:type="dxa" w:w="1728"/>
+            <w:tcW w:type="dxa" w:w="2160"/>
           </w:tcPr>
           <w:p>
             <w:r/>
@@ -1469,7 +1471,7 @@
         </w:tc>
         <w:tc>
           <w:tcPr>
-            <w:tcW w:type="dxa" w:w="1728"/>
+            <w:tcW w:type="dxa" w:w="4896"/>
           </w:tcPr>
           <w:p>
             <w:r/>
@@ -1499,7 +1501,7 @@
         </w:tc>
         <w:tc>
           <w:tcPr>
-            <w:tcW w:type="dxa" w:w="1728"/>
+            <w:tcW w:type="dxa" w:w="1152"/>
           </w:tcPr>
           <w:p>
             <w:r/>
@@ -1516,7 +1518,7 @@
       <w:tr>
         <w:tc>
           <w:tcPr>
-            <w:tcW w:type="dxa" w:w="1728"/>
+            <w:tcW w:type="dxa" w:w="504"/>
           </w:tcPr>
           <w:p>
             <w:r/>
@@ -1531,7 +1533,7 @@
         </w:tc>
         <w:tc>
           <w:tcPr>
-            <w:tcW w:type="dxa" w:w="1728"/>
+            <w:tcW w:type="dxa" w:w="2160"/>
           </w:tcPr>
           <w:p>
             <w:r/>
@@ -1546,7 +1548,7 @@
         </w:tc>
         <w:tc>
           <w:tcPr>
-            <w:tcW w:type="dxa" w:w="1728"/>
+            <w:tcW w:type="dxa" w:w="4896"/>
           </w:tcPr>
           <w:p>
             <w:r/>
@@ -1576,7 +1578,7 @@
         </w:tc>
         <w:tc>
           <w:tcPr>
-            <w:tcW w:type="dxa" w:w="1728"/>
+            <w:tcW w:type="dxa" w:w="1152"/>
           </w:tcPr>
           <w:p>
             <w:r/>
@@ -1593,7 +1595,7 @@
       <w:tr>
         <w:tc>
           <w:tcPr>
-            <w:tcW w:type="dxa" w:w="1728"/>
+            <w:tcW w:type="dxa" w:w="504"/>
           </w:tcPr>
           <w:p>
             <w:r/>
@@ -1608,7 +1610,7 @@
         </w:tc>
         <w:tc>
           <w:tcPr>
-            <w:tcW w:type="dxa" w:w="1728"/>
+            <w:tcW w:type="dxa" w:w="2160"/>
           </w:tcPr>
           <w:p>
             <w:r/>
@@ -1623,7 +1625,7 @@
         </w:tc>
         <w:tc>
           <w:tcPr>
-            <w:tcW w:type="dxa" w:w="1728"/>
+            <w:tcW w:type="dxa" w:w="4896"/>
           </w:tcPr>
           <w:p>
             <w:r/>
@@ -1653,7 +1655,7 @@
         </w:tc>
         <w:tc>
           <w:tcPr>
-            <w:tcW w:type="dxa" w:w="1728"/>
+            <w:tcW w:type="dxa" w:w="1152"/>
           </w:tcPr>
           <w:p>
             <w:r/>
@@ -1670,7 +1672,7 @@
       <w:tr>
         <w:tc>
           <w:tcPr>
-            <w:tcW w:type="dxa" w:w="1728"/>
+            <w:tcW w:type="dxa" w:w="504"/>
           </w:tcPr>
           <w:p>
             <w:r/>
@@ -1685,7 +1687,7 @@
         </w:tc>
         <w:tc>
           <w:tcPr>
-            <w:tcW w:type="dxa" w:w="1728"/>
+            <w:tcW w:type="dxa" w:w="2160"/>
           </w:tcPr>
           <w:p>
             <w:r/>
@@ -1700,7 +1702,7 @@
         </w:tc>
         <w:tc>
           <w:tcPr>
-            <w:tcW w:type="dxa" w:w="1728"/>
+            <w:tcW w:type="dxa" w:w="4896"/>
           </w:tcPr>
           <w:p>
             <w:r/>
@@ -1730,7 +1732,7 @@
         </w:tc>
         <w:tc>
           <w:tcPr>
-            <w:tcW w:type="dxa" w:w="1728"/>
+            <w:tcW w:type="dxa" w:w="1152"/>
           </w:tcPr>
           <w:p>
             <w:r/>
@@ -1747,7 +1749,7 @@
       <w:tr>
         <w:tc>
           <w:tcPr>
-            <w:tcW w:type="dxa" w:w="1728"/>
+            <w:tcW w:type="dxa" w:w="504"/>
           </w:tcPr>
           <w:p>
             <w:r/>
@@ -1762,7 +1764,7 @@
         </w:tc>
         <w:tc>
           <w:tcPr>
-            <w:tcW w:type="dxa" w:w="1728"/>
+            <w:tcW w:type="dxa" w:w="2160"/>
           </w:tcPr>
           <w:p>
             <w:r/>
@@ -1777,7 +1779,7 @@
         </w:tc>
         <w:tc>
           <w:tcPr>
-            <w:tcW w:type="dxa" w:w="1728"/>
+            <w:tcW w:type="dxa" w:w="4896"/>
           </w:tcPr>
           <w:p>
             <w:r/>
@@ -1807,7 +1809,7 @@
         </w:tc>
         <w:tc>
           <w:tcPr>
-            <w:tcW w:type="dxa" w:w="1728"/>
+            <w:tcW w:type="dxa" w:w="1152"/>
           </w:tcPr>
           <w:p>
             <w:r/>
@@ -1824,7 +1826,7 @@
       <w:tr>
         <w:tc>
           <w:tcPr>
-            <w:tcW w:type="dxa" w:w="1728"/>
+            <w:tcW w:type="dxa" w:w="504"/>
           </w:tcPr>
           <w:p>
             <w:r/>
@@ -1839,7 +1841,7 @@
         </w:tc>
         <w:tc>
           <w:tcPr>
-            <w:tcW w:type="dxa" w:w="1728"/>
+            <w:tcW w:type="dxa" w:w="2160"/>
           </w:tcPr>
           <w:p>
             <w:r/>
@@ -1854,7 +1856,7 @@
         </w:tc>
         <w:tc>
           <w:tcPr>
-            <w:tcW w:type="dxa" w:w="1728"/>
+            <w:tcW w:type="dxa" w:w="4896"/>
           </w:tcPr>
           <w:p>
             <w:r/>
@@ -1884,7 +1886,7 @@
         </w:tc>
         <w:tc>
           <w:tcPr>
-            <w:tcW w:type="dxa" w:w="1728"/>
+            <w:tcW w:type="dxa" w:w="1152"/>
           </w:tcPr>
           <w:p>
             <w:r/>
@@ -1901,7 +1903,7 @@
       <w:tr>
         <w:tc>
           <w:tcPr>
-            <w:tcW w:type="dxa" w:w="1728"/>
+            <w:tcW w:type="dxa" w:w="504"/>
           </w:tcPr>
           <w:p>
             <w:r/>
@@ -1916,7 +1918,7 @@
         </w:tc>
         <w:tc>
           <w:tcPr>
-            <w:tcW w:type="dxa" w:w="1728"/>
+            <w:tcW w:type="dxa" w:w="2160"/>
           </w:tcPr>
           <w:p>
             <w:r/>
@@ -1931,7 +1933,7 @@
         </w:tc>
         <w:tc>
           <w:tcPr>
-            <w:tcW w:type="dxa" w:w="1728"/>
+            <w:tcW w:type="dxa" w:w="4896"/>
           </w:tcPr>
           <w:p>
             <w:r/>
@@ -1961,7 +1963,7 @@
         </w:tc>
         <w:tc>
           <w:tcPr>
-            <w:tcW w:type="dxa" w:w="1728"/>
+            <w:tcW w:type="dxa" w:w="1152"/>
           </w:tcPr>
           <w:p>
             <w:r/>
@@ -1978,7 +1980,7 @@
       <w:tr>
         <w:tc>
           <w:tcPr>
-            <w:tcW w:type="dxa" w:w="1728"/>
+            <w:tcW w:type="dxa" w:w="504"/>
           </w:tcPr>
           <w:p>
             <w:r/>
@@ -1993,7 +1995,7 @@
         </w:tc>
         <w:tc>
           <w:tcPr>
-            <w:tcW w:type="dxa" w:w="1728"/>
+            <w:tcW w:type="dxa" w:w="2160"/>
           </w:tcPr>
           <w:p>
             <w:r/>
@@ -2008,7 +2010,7 @@
         </w:tc>
         <w:tc>
           <w:tcPr>
-            <w:tcW w:type="dxa" w:w="1728"/>
+            <w:tcW w:type="dxa" w:w="4896"/>
           </w:tcPr>
           <w:p>
             <w:r/>
@@ -2038,7 +2040,7 @@
         </w:tc>
         <w:tc>
           <w:tcPr>
-            <w:tcW w:type="dxa" w:w="1728"/>
+            <w:tcW w:type="dxa" w:w="1152"/>
           </w:tcPr>
           <w:p>
             <w:r/>
@@ -2055,7 +2057,7 @@
       <w:tr>
         <w:tc>
           <w:tcPr>
-            <w:tcW w:type="dxa" w:w="1728"/>
+            <w:tcW w:type="dxa" w:w="504"/>
           </w:tcPr>
           <w:p>
             <w:r/>
@@ -2070,7 +2072,7 @@
         </w:tc>
         <w:tc>
           <w:tcPr>
-            <w:tcW w:type="dxa" w:w="1728"/>
+            <w:tcW w:type="dxa" w:w="2160"/>
           </w:tcPr>
           <w:p>
             <w:r/>
@@ -2085,7 +2087,7 @@
         </w:tc>
         <w:tc>
           <w:tcPr>
-            <w:tcW w:type="dxa" w:w="1728"/>
+            <w:tcW w:type="dxa" w:w="4896"/>
           </w:tcPr>
           <w:p>
             <w:r/>
@@ -2115,7 +2117,7 @@
         </w:tc>
         <w:tc>
           <w:tcPr>
-            <w:tcW w:type="dxa" w:w="1728"/>
+            <w:tcW w:type="dxa" w:w="1152"/>
           </w:tcPr>
           <w:p>
             <w:r/>
@@ -2132,7 +2134,7 @@
       <w:tr>
         <w:tc>
           <w:tcPr>
-            <w:tcW w:type="dxa" w:w="1728"/>
+            <w:tcW w:type="dxa" w:w="504"/>
           </w:tcPr>
           <w:p>
             <w:r/>
@@ -2147,7 +2149,7 @@
         </w:tc>
         <w:tc>
           <w:tcPr>
-            <w:tcW w:type="dxa" w:w="1728"/>
+            <w:tcW w:type="dxa" w:w="2160"/>
           </w:tcPr>
           <w:p>
             <w:r/>
@@ -2162,7 +2164,7 @@
         </w:tc>
         <w:tc>
           <w:tcPr>
-            <w:tcW w:type="dxa" w:w="1728"/>
+            <w:tcW w:type="dxa" w:w="4896"/>
           </w:tcPr>
           <w:p>
             <w:r/>
@@ -2192,7 +2194,7 @@
         </w:tc>
         <w:tc>
           <w:tcPr>
-            <w:tcW w:type="dxa" w:w="1728"/>
+            <w:tcW w:type="dxa" w:w="1152"/>
           </w:tcPr>
           <w:p>
             <w:r/>
@@ -2209,7 +2211,7 @@
       <w:tr>
         <w:tc>
           <w:tcPr>
-            <w:tcW w:type="dxa" w:w="1728"/>
+            <w:tcW w:type="dxa" w:w="504"/>
           </w:tcPr>
           <w:p>
             <w:r/>
@@ -2224,7 +2226,7 @@
         </w:tc>
         <w:tc>
           <w:tcPr>
-            <w:tcW w:type="dxa" w:w="1728"/>
+            <w:tcW w:type="dxa" w:w="2160"/>
           </w:tcPr>
           <w:p>
             <w:r/>
@@ -2239,7 +2241,7 @@
         </w:tc>
         <w:tc>
           <w:tcPr>
-            <w:tcW w:type="dxa" w:w="1728"/>
+            <w:tcW w:type="dxa" w:w="4896"/>
           </w:tcPr>
           <w:p>
             <w:r/>
@@ -2269,7 +2271,7 @@
         </w:tc>
         <w:tc>
           <w:tcPr>
-            <w:tcW w:type="dxa" w:w="1728"/>
+            <w:tcW w:type="dxa" w:w="1152"/>
           </w:tcPr>
           <w:p>
             <w:r/>
@@ -2301,6 +2303,7 @@
       <w:tblPr>
         <w:tblStyle w:val="LightGrid-Accent1"/>
         <w:tblW w:type="auto" w:w="0"/>
+        <w:tblLayout w:type="fixed"/>
         <w:tblLook w:firstColumn="1" w:firstRow="1" w:lastColumn="0" w:lastRow="0" w:noHBand="0" w:noVBand="1" w:val="04A0"/>
       </w:tblPr>
       <w:tblGrid>

</xml_diff>

<commit_message>
docs(manuale): aggiungi Cloud Functions come TIER 2 fondamentale
Update al manuale generale (1_Manuale_Generale_Silvestre.docx):

Sezione 2 Firebase: ampliata la voce "Cloud Functions" con i casi
d'uso reali (FCM push, cron pulizia pending 30gg, webhook futuri)
e link a sezione 4 + Appendice D.

Sezione 4 (TIER): nuova riga TIER 2 "Cloud Functions Firebase
(FONDAMENTALE)" che spiega:
  - Senza CF molte automazioni restano manual
  - Serve attivare il piano Blaze (~0-5€/mese realistico per il negozio)
  - 2-3h sviluppo per la prima Cloud Function

Sezione 4 (TIER): rimossi Stripe LIVE e Satispay LIVE (metodi
pagamento dismessi). Aggiunto Bonifico Istantaneo come gia' fatto.

Fix: script ora sovrascrive il file corretto 1_Manuale_Generale_*.docx
(non MANUALE_GENERALE_*.docx come prima — quello era un duplicato).

Co-Authored-By: Claude Opus 4.7 (1M context) <noreply@anthropic.com>
</commit_message>
<xml_diff>
--- a/docs/1_Manuale_Generale_Silvestre.docx
+++ b/docs/1_Manuale_Generale_Silvestre.docx
@@ -53,7 +53,7 @@
           <w:color w:val="7A7A7A"/>
           <w:sz w:val="20"/>
         </w:rPr>
-        <w:t>v1.0 — 18/05/2026</w:t>
+        <w:t>v1.0 — 20/05/2026</w:t>
       </w:r>
     </w:p>
     <w:p/>
@@ -689,7 +689,7 @@
           <w:rFonts w:ascii="Calibri" w:hAnsi="Calibri"/>
           <w:sz w:val="22"/>
         </w:rPr>
-        <w:t>Cloud Functions: piccoli script automatici (es. "manda push all'operatore quando arriva un nuovo ordine").</w:t>
+        <w:t>Cloud Functions: piccoli script automatici. Sono FONDAMENTALI per: push notification reali (FCM) ai clienti app, cron job di pulizia automatica dei pending soft opt-in dopo 30 giorni, eventuali webhook (es. WhatsApp Cloud API se in futuro attivi l'invio automatizzato). Oggi non attivi: serve passare al piano Blaze. Vedi sezione 4 (TIER 2) e Appendice D per il setup.</w:t>
       </w:r>
     </w:p>
     <w:p>
@@ -1696,7 +1696,7 @@
                 <w:rFonts w:ascii="Calibri" w:hAnsi="Calibri"/>
                 <w:sz w:val="21"/>
               </w:rPr>
-              <w:t>Stripe LIVE (PIVA + chiavi)</w:t>
+              <w:t>Bonifico Istantaneo configurato</w:t>
             </w:r>
           </w:p>
         </w:tc>
@@ -1711,7 +1711,7 @@
                 <w:rFonts w:ascii="Calibri" w:hAnsi="Calibri"/>
                 <w:sz w:val="21"/>
               </w:rPr>
-              <w:t>Senza Stripe LIVE i pagamenti con carta sono in modalità test: nessun soldo arriva sul tuo conto.</w:t>
+              <w:t>Pagamento online a 0% commissioni: IBAN del negozio hardcoded in app (Banca Fideuram, Antonio Silvestre). Cliente paga dalla sua app bancaria, carica ricevuta, operatore conferma in app.</w:t>
             </w:r>
           </w:p>
         </w:tc>
@@ -1726,7 +1726,7 @@
                 <w:rFonts w:ascii="Calibri" w:hAnsi="Calibri"/>
                 <w:sz w:val="21"/>
               </w:rPr>
-              <w:t>~1.4% + 0,25€/tx</w:t>
+              <w:t>GRATIS (0% fee)</w:t>
             </w:r>
           </w:p>
         </w:tc>
@@ -1741,84 +1741,7 @@
                 <w:rFonts w:ascii="Calibri" w:hAnsi="Calibri"/>
                 <w:sz w:val="21"/>
               </w:rPr>
-              <w:t>1-2 gg</w:t>
-            </w:r>
-          </w:p>
-        </w:tc>
-      </w:tr>
-      <w:tr>
-        <w:tc>
-          <w:tcPr>
-            <w:tcW w:type="dxa" w:w="504"/>
-          </w:tcPr>
-          <w:p>
-            <w:r/>
-            <w:r>
-              <w:rPr>
-                <w:rFonts w:ascii="Calibri" w:hAnsi="Calibri"/>
-                <w:sz w:val="21"/>
-              </w:rPr>
-              <w:t>1</w:t>
-            </w:r>
-          </w:p>
-        </w:tc>
-        <w:tc>
-          <w:tcPr>
-            <w:tcW w:type="dxa" w:w="2160"/>
-          </w:tcPr>
-          <w:p>
-            <w:r/>
-            <w:r>
-              <w:rPr>
-                <w:rFonts w:ascii="Calibri" w:hAnsi="Calibri"/>
-                <w:sz w:val="21"/>
-              </w:rPr>
-              <w:t>Satispay Business LIVE</w:t>
-            </w:r>
-          </w:p>
-        </w:tc>
-        <w:tc>
-          <w:tcPr>
-            <w:tcW w:type="dxa" w:w="4896"/>
-          </w:tcPr>
-          <w:p>
-            <w:r/>
-            <w:r>
-              <w:rPr>
-                <w:rFonts w:ascii="Calibri" w:hAnsi="Calibri"/>
-                <w:sz w:val="21"/>
-              </w:rPr>
-              <w:t>Satispay è popolare in Italia, soprattutto sotto i 40 anni. Senza account LIVE perdi una fascia di clienti.</w:t>
-            </w:r>
-          </w:p>
-        </w:tc>
-        <w:tc>
-          <w:tcPr>
-            <w:tcW w:type="dxa" w:w="1728"/>
-          </w:tcPr>
-          <w:p>
-            <w:r/>
-            <w:r>
-              <w:rPr>
-                <w:rFonts w:ascii="Calibri" w:hAnsi="Calibri"/>
-                <w:sz w:val="21"/>
-              </w:rPr>
-              <w:t>~1.5%/tx</w:t>
-            </w:r>
-          </w:p>
-        </w:tc>
-        <w:tc>
-          <w:tcPr>
-            <w:tcW w:type="dxa" w:w="1152"/>
-          </w:tcPr>
-          <w:p>
-            <w:r/>
-            <w:r>
-              <w:rPr>
-                <w:rFonts w:ascii="Calibri" w:hAnsi="Calibri"/>
-                <w:sz w:val="21"/>
-              </w:rPr>
-              <w:t>7 gg</w:t>
+              <w:t>Fatto</w:t>
             </w:r>
           </w:p>
         </w:tc>
@@ -1896,6 +1819,83 @@
                 <w:sz w:val="21"/>
               </w:rPr>
               <w:t>30 min</w:t>
+            </w:r>
+          </w:p>
+        </w:tc>
+      </w:tr>
+      <w:tr>
+        <w:tc>
+          <w:tcPr>
+            <w:tcW w:type="dxa" w:w="504"/>
+          </w:tcPr>
+          <w:p>
+            <w:r/>
+            <w:r>
+              <w:rPr>
+                <w:rFonts w:ascii="Calibri" w:hAnsi="Calibri"/>
+                <w:sz w:val="21"/>
+              </w:rPr>
+              <w:t>2</w:t>
+            </w:r>
+          </w:p>
+        </w:tc>
+        <w:tc>
+          <w:tcPr>
+            <w:tcW w:type="dxa" w:w="2160"/>
+          </w:tcPr>
+          <w:p>
+            <w:r/>
+            <w:r>
+              <w:rPr>
+                <w:rFonts w:ascii="Calibri" w:hAnsi="Calibri"/>
+                <w:sz w:val="21"/>
+              </w:rPr>
+              <w:t>Cloud Functions Firebase (FONDAMENTALE)</w:t>
+            </w:r>
+          </w:p>
+        </w:tc>
+        <w:tc>
+          <w:tcPr>
+            <w:tcW w:type="dxa" w:w="4896"/>
+          </w:tcPr>
+          <w:p>
+            <w:r/>
+            <w:r>
+              <w:rPr>
+                <w:rFonts w:ascii="Calibri" w:hAnsi="Calibri"/>
+                <w:sz w:val="21"/>
+              </w:rPr>
+              <w:t>Senza Cloud Functions oggi sei bloccato su molte automazioni: push notification reali (FCM ai clienti app), cron job di pulizia automatica dei pending soft opt-in dopo 30gg, ricezione webhook per risposte WhatsApp Cloud API, e in futuro qualsiasi automazione server-side. Serve attivare il piano Blaze (pay-as-you-go) — in pratica resta gratis sotto soglia per un negozio piccolo (~0-5€/mese stimati). Senza Blaze tutto resta manual.</w:t>
+            </w:r>
+          </w:p>
+        </w:tc>
+        <w:tc>
+          <w:tcPr>
+            <w:tcW w:type="dxa" w:w="1728"/>
+          </w:tcPr>
+          <w:p>
+            <w:r/>
+            <w:r>
+              <w:rPr>
+                <w:rFonts w:ascii="Calibri" w:hAnsi="Calibri"/>
+                <w:sz w:val="21"/>
+              </w:rPr>
+              <w:t>Blaze: ~0-5€/mese</w:t>
+            </w:r>
+          </w:p>
+        </w:tc>
+        <w:tc>
+          <w:tcPr>
+            <w:tcW w:type="dxa" w:w="1152"/>
+          </w:tcPr>
+          <w:p>
+            <w:r/>
+            <w:r>
+              <w:rPr>
+                <w:rFonts w:ascii="Calibri" w:hAnsi="Calibri"/>
+                <w:sz w:val="21"/>
+              </w:rPr>
+              <w:t>2-3 h sviluppo</w:t>
             </w:r>
           </w:p>
         </w:tc>
@@ -2685,7 +2685,7 @@
           <w:color w:val="7A7A7A"/>
           <w:sz w:val="20"/>
         </w:rPr>
-        <w:t>Silvestre Fotoservizi · 18/05/2026 · v1.0</w:t>
+        <w:t>Silvestre Fotoservizi · 20/05/2026 · v1.0</w:t>
       </w:r>
     </w:p>
     <w:sectPr>

</xml_diff>

<commit_message>
docs(manuale): aggiorna piano Blaze + spiega benefit free vs blaze
Manuale generale aggiornato:
  - Tabella servizi: Firebase ora "Blaze (pay-as-you-go) ~0-5€/mese"
  - Sezione Firebase: spiegato che il piano e' Blaze dal 20/05/2026,
    mantiene tutte le soglie free, costo realistico Silvestre ~0€/mese
  - TIER 1 nuovo: "Piano Blaze attivato" come prerequisito
  - TIER 2 nuovo: "Cloud Functions deploy (FCM + cron)"

Co-Authored-By: Claude Opus 4.7 (1M context) <noreply@anthropic.com>
</commit_message>
<xml_diff>
--- a/docs/1_Manuale_Generale_Silvestre.docx
+++ b/docs/1_Manuale_Generale_Silvestre.docx
@@ -424,7 +424,7 @@
                 <w:rFonts w:ascii="Calibri" w:hAnsi="Calibri"/>
                 <w:sz w:val="21"/>
               </w:rPr>
-              <w:t>Gratis (Spark)</w:t>
+              <w:t>Blaze (pay-as-you-go) ~0-5€/mese</w:t>
             </w:r>
           </w:p>
         </w:tc>
@@ -439,7 +439,7 @@
                 <w:rFonts w:ascii="Calibri" w:hAnsi="Calibri"/>
                 <w:sz w:val="21"/>
               </w:rPr>
-              <w:t>Auth + database + push + hosting</w:t>
+              <w:t>Auth + database + push + hosting + Cloud Functions</w:t>
             </w:r>
           </w:p>
         </w:tc>
@@ -744,12 +744,12 @@
       <w:r>
         <w:rPr>
           <w:rFonts w:ascii="Calibri" w:hAnsi="Calibri"/>
-          <w:b w:val="0"/>
+          <w:b/>
           <w:i w:val="0"/>
           <w:color w:val="2B2B2B"/>
           <w:sz w:val="22"/>
         </w:rPr>
-        <w:t>Costo: gratis per piccoli numeri. Quando attivi le push automatiche serve passare al piano Blaze (~0-5€/mese in pratica per un negozio piccolo).</w:t>
+        <w:t>Costo: dal 20 maggio 2026 il progetto e' configurato col piano BLAZE (pay-as-you-go). Significa: stesse soglie gratuite del piano Spark (50k reads/giorno, 20k writes/giorno, 1 GiB storage, 2M Cloud Functions invocazioni/mese, FCM ILLIMITATO), ma niente piu' errori 429 quando si supera la soglia istantanea. Si paga solo sopra soglia: per Silvestre realisticamente 0€/mese, max 1-3€/mese se l'app cresce. Il vero motivo dell'upgrade non e' il costo (e' 0€) ma sbloccare Cloud Functions e rate limits adeguati.</w:t>
       </w:r>
     </w:p>
     <w:p/>
@@ -1835,6 +1835,83 @@
                 <w:rFonts w:ascii="Calibri" w:hAnsi="Calibri"/>
                 <w:sz w:val="21"/>
               </w:rPr>
+              <w:t>1</w:t>
+            </w:r>
+          </w:p>
+        </w:tc>
+        <w:tc>
+          <w:tcPr>
+            <w:tcW w:type="dxa" w:w="2160"/>
+          </w:tcPr>
+          <w:p>
+            <w:r/>
+            <w:r>
+              <w:rPr>
+                <w:rFonts w:ascii="Calibri" w:hAnsi="Calibri"/>
+                <w:sz w:val="21"/>
+              </w:rPr>
+              <w:t>Piano Blaze attivato (FATTO)</w:t>
+            </w:r>
+          </w:p>
+        </w:tc>
+        <w:tc>
+          <w:tcPr>
+            <w:tcW w:type="dxa" w:w="4896"/>
+          </w:tcPr>
+          <w:p>
+            <w:r/>
+            <w:r>
+              <w:rPr>
+                <w:rFonts w:ascii="Calibri" w:hAnsi="Calibri"/>
+                <w:sz w:val="21"/>
+              </w:rPr>
+              <w:t>Pay-as-you-go senza limiti operativi. Sblocca: Cloud Functions, FCM push reali, cron job automatici, niente piu' errori 429. Costo realistico per Silvestre: 0€/mese (sotto le soglie gratuite incluse). Soglie free: 50k reads/g, 20k writes/g, 1 GiB storage, 2M Cloud Functions invocazioni/mese.</w:t>
+            </w:r>
+          </w:p>
+        </w:tc>
+        <w:tc>
+          <w:tcPr>
+            <w:tcW w:type="dxa" w:w="1728"/>
+          </w:tcPr>
+          <w:p>
+            <w:r/>
+            <w:r>
+              <w:rPr>
+                <w:rFonts w:ascii="Calibri" w:hAnsi="Calibri"/>
+                <w:sz w:val="21"/>
+              </w:rPr>
+              <w:t>~0€/mese stimato</w:t>
+            </w:r>
+          </w:p>
+        </w:tc>
+        <w:tc>
+          <w:tcPr>
+            <w:tcW w:type="dxa" w:w="1152"/>
+          </w:tcPr>
+          <w:p>
+            <w:r/>
+            <w:r>
+              <w:rPr>
+                <w:rFonts w:ascii="Calibri" w:hAnsi="Calibri"/>
+                <w:sz w:val="21"/>
+              </w:rPr>
+              <w:t>5 min (carta)</w:t>
+            </w:r>
+          </w:p>
+        </w:tc>
+      </w:tr>
+      <w:tr>
+        <w:tc>
+          <w:tcPr>
+            <w:tcW w:type="dxa" w:w="504"/>
+          </w:tcPr>
+          <w:p>
+            <w:r/>
+            <w:r>
+              <w:rPr>
+                <w:rFonts w:ascii="Calibri" w:hAnsi="Calibri"/>
+                <w:sz w:val="21"/>
+              </w:rPr>
               <w:t>2</w:t>
             </w:r>
           </w:p>
@@ -1850,7 +1927,7 @@
                 <w:rFonts w:ascii="Calibri" w:hAnsi="Calibri"/>
                 <w:sz w:val="21"/>
               </w:rPr>
-              <w:t>Cloud Functions Firebase (FONDAMENTALE)</w:t>
+              <w:t>Cloud Functions deploy (FCM + cron)</w:t>
             </w:r>
           </w:p>
         </w:tc>
@@ -1865,7 +1942,7 @@
                 <w:rFonts w:ascii="Calibri" w:hAnsi="Calibri"/>
                 <w:sz w:val="21"/>
               </w:rPr>
-              <w:t>Senza Cloud Functions oggi sei bloccato su molte automazioni: push notification reali (FCM ai clienti app), cron job di pulizia automatica dei pending soft opt-in dopo 30gg, ricezione webhook per risposte WhatsApp Cloud API, e in futuro qualsiasi automazione server-side. Serve attivare il piano Blaze (pay-as-you-go) — in pratica resta gratis sotto soglia per un negozio piccolo (~0-5€/mese stimati). Senza Blaze tutto resta manual.</w:t>
+              <w:t>Una volta attivo Blaze, deploy delle Cloud Functions per: (a) invio FCM push ai clienti app quando l'operatore crea promo, (b) cron job giornaliero che marca optInStatus=no i pending oltre 30 giorni, (c) eventuale webhook WhatsApp Cloud API. Tutto serverless, nessuna manutenzione.</w:t>
             </w:r>
           </w:p>
         </w:tc>
@@ -1880,7 +1957,7 @@
                 <w:rFonts w:ascii="Calibri" w:hAnsi="Calibri"/>
                 <w:sz w:val="21"/>
               </w:rPr>
-              <w:t>Blaze: ~0-5€/mese</w:t>
+              <w:t>Inclusi nel Blaze</w:t>
             </w:r>
           </w:p>
         </w:tc>

</xml_diff>

<commit_message>
docs(manuale): chiarisci differenza FCM (gratis auto) vs WhatsApp Cloud API (paid)
TIER 2 (Cloud Functions): chiarisce che FCM push automatiche sono
GRATIS con Cloud Functions, ma WhatsApp automatici NO — serve un
servizio Meta a pagamento separato.

Nuova riga TIER 3 (opzionale futuro): WhatsApp Cloud API Meta
con tutti i costi/tempi/benefit (auto-send + auto-inbox SI/STOP).

Co-Authored-By: Claude Opus 4.7 (1M context) <noreply@anthropic.com>
</commit_message>
<xml_diff>
--- a/docs/1_Manuale_Generale_Silvestre.docx
+++ b/docs/1_Manuale_Generale_Silvestre.docx
@@ -1942,7 +1942,7 @@
                 <w:rFonts w:ascii="Calibri" w:hAnsi="Calibri"/>
                 <w:sz w:val="21"/>
               </w:rPr>
-              <w:t>Una volta attivo Blaze, deploy delle Cloud Functions per: (a) invio FCM push ai clienti app quando l'operatore crea promo, (b) cron job giornaliero che marca optInStatus=no i pending oltre 30 giorni, (c) eventuale webhook WhatsApp Cloud API. Tutto serverless, nessuna manutenzione.</w:t>
+              <w:t>Una volta attivo Blaze, deploy delle Cloud Functions per: (a) invio FCM push ai clienti app quando l'operatore crea promo (GRATIS, parte automatico senza click), (b) cron job giornaliero che marca optInStatus=no i pending oltre 30 giorni. NB: WhatsApp automatici NON sono inclusi qui — serve un servizio separato (WhatsApp Cloud API Meta) a pagamento ~0.07€/messaggio. Per ora WhatsApp resta manual batch.</w:t>
             </w:r>
           </w:p>
         </w:tc>
@@ -1973,6 +1973,83 @@
                 <w:sz w:val="21"/>
               </w:rPr>
               <w:t>2-3 h sviluppo</w:t>
+            </w:r>
+          </w:p>
+        </w:tc>
+      </w:tr>
+      <w:tr>
+        <w:tc>
+          <w:tcPr>
+            <w:tcW w:type="dxa" w:w="504"/>
+          </w:tcPr>
+          <w:p>
+            <w:r/>
+            <w:r>
+              <w:rPr>
+                <w:rFonts w:ascii="Calibri" w:hAnsi="Calibri"/>
+                <w:sz w:val="21"/>
+              </w:rPr>
+              <w:t>3</w:t>
+            </w:r>
+          </w:p>
+        </w:tc>
+        <w:tc>
+          <w:tcPr>
+            <w:tcW w:type="dxa" w:w="2160"/>
+          </w:tcPr>
+          <w:p>
+            <w:r/>
+            <w:r>
+              <w:rPr>
+                <w:rFonts w:ascii="Calibri" w:hAnsi="Calibri"/>
+                <w:sz w:val="21"/>
+              </w:rPr>
+              <w:t>WhatsApp Cloud API Meta (opzionale futuro)</w:t>
+            </w:r>
+          </w:p>
+        </w:tc>
+        <w:tc>
+          <w:tcPr>
+            <w:tcW w:type="dxa" w:w="4896"/>
+          </w:tcPr>
+          <w:p>
+            <w:r/>
+            <w:r>
+              <w:rPr>
+                <w:rFonts w:ascii="Calibri" w:hAnsi="Calibri"/>
+                <w:sz w:val="21"/>
+              </w:rPr>
+              <w:t>Per inviare WhatsApp totalmente automatici (senza click dell'operatore), serve il servizio Cloud API di Meta. Richiede: (a) verifica Meta Business Manager, (b) approvazione di ogni template promo da parte di Meta (1-2 giorni per template), (c) costo ~0.07€ per messaggio marketing in Italia. Esempi: promo a 2000 opted-in = ~140€, soft opt-in iniziale a 6700 = ~470€ una tantum. Con questo attivato, anche le risposte SI/STOP arrivano automatiche via webhook (no piu' Inbox manuale).</w:t>
+            </w:r>
+          </w:p>
+        </w:tc>
+        <w:tc>
+          <w:tcPr>
+            <w:tcW w:type="dxa" w:w="1728"/>
+          </w:tcPr>
+          <w:p>
+            <w:r/>
+            <w:r>
+              <w:rPr>
+                <w:rFonts w:ascii="Calibri" w:hAnsi="Calibri"/>
+                <w:sz w:val="21"/>
+              </w:rPr>
+              <w:t>~0.07€/msg</w:t>
+            </w:r>
+          </w:p>
+        </w:tc>
+        <w:tc>
+          <w:tcPr>
+            <w:tcW w:type="dxa" w:w="1152"/>
+          </w:tcPr>
+          <w:p>
+            <w:r/>
+            <w:r>
+              <w:rPr>
+                <w:rFonts w:ascii="Calibri" w:hAnsi="Calibri"/>
+                <w:sz w:val="21"/>
+              </w:rPr>
+              <w:t>5-7 gg verifica Meta</w:t>
             </w:r>
           </w:p>
         </w:tc>

</xml_diff>